<commit_message>
docs: reword one-page summary flow to avoid ambiguous T0/profile phrasing
Co-Authored-By: Claude Sonnet 5.5 <noreply@anthropic.com>
</commit_message>
<xml_diff>
--- a/docs/teaching_grant_2026/APPLICATION_PACKAGE/docx/80_one_page_summary.docx
+++ b/docs/teaching_grant_2026/APPLICATION_PACKAGE/docx/80_one_page_summary.docx
@@ -69,12 +69,12 @@
     </w:p>
     <w:p>
       <w:r>
-        <w:t>能力画像、个性化任务和教师干预嵌入 7 天见习：D1 独立在线考核 T0 → D2—D3 分步训练建立能力画像 →</w:t>
+        <w:t>能力画像、个性化任务和教师干预嵌入 7 天见习：D1 独立在线考核 T0。D2—D3 分步训练，建立能力画像。</w:t>
       </w:r>
     </w:p>
     <w:p>
       <w:r>
-        <w:t>D4—D5 依据 D2/D3 证据个性化强化与教师反馈 → D6 独立在线考核 T1 → D7 总结与问卷。</w:t>
+        <w:t>D4—D5 依据 D2/D3 证据个性化强化与教师反馈。D6 独立在线考核 T1。D7 总结与问卷。</w:t>
       </w:r>
     </w:p>
     <w:p>

</xml_diff>